<commit_message>
Update Milestone 4 report: add Limitations, fix Figure X and duplicate Conclusion
</commit_message>
<xml_diff>
--- a/report/Milestone_4_Group_3.docx
+++ b/report/Milestone_4_Group_3.docx
@@ -12,8 +12,6 @@
       </w:pPr>
       <w:r>
         <w:t>Problem and Requirements</w:t>
-      </w:r>
-      <w:r>
         <w:br/>
       </w:r>
     </w:p>
@@ -114,15 +112,7 @@
     </w:p>
     <w:p>
       <w:r>
-        <w:t>Every accepted submission request generates a unique `</w:t>
-      </w:r>
-      <w:proofErr w:type="spellStart"/>
-      <w:r>
-        <w:t>submission_id</w:t>
-      </w:r>
-      <w:proofErr w:type="spellEnd"/>
-      <w:r>
-        <w:t>`, which serves as the correlation identifier throughout the process flow. The system also supports controlled failure states. A submission can transition to `REJECTED` when validation or metadata checks fail, while an uncompleted submission can transition from `PENDING` to `EXPIRED`.</w:t>
+        <w:t>Every accepted submission request generates a unique `submission_id`, which serves as the correlation identifier throughout the process flow. The system also supports controlled failure states. A submission can transition to `REJECTED` when validation or metadata checks fail, while an uncompleted submission can transition from `PENDING` to `EXPIRED`.</w:t>
       </w:r>
     </w:p>
     <w:p/>
@@ -137,8 +127,6 @@
     <w:p>
       <w:r>
         <w:t>The system was designed to satisfy the following requirements:</w:t>
-      </w:r>
-      <w:r>
         <w:br/>
       </w:r>
     </w:p>
@@ -761,25 +749,7 @@
           <w:sz w:val="20"/>
           <w:szCs w:val="20"/>
         </w:rPr>
-        <w:t xml:space="preserve"> A submission should be traceable using its unique </w:t>
-      </w:r>
-      <w:proofErr w:type="spellStart"/>
-      <w:r>
-        <w:rPr>
-          <w:rFonts w:asciiTheme="minorHAnsi" w:hAnsiTheme="minorHAnsi" w:cstheme="minorHAnsi"/>
-          <w:sz w:val="20"/>
-          <w:szCs w:val="20"/>
-        </w:rPr>
-        <w:t>submission_id</w:t>
-      </w:r>
-      <w:proofErr w:type="spellEnd"/>
-      <w:r>
-        <w:rPr>
-          <w:rFonts w:asciiTheme="minorHAnsi" w:hAnsiTheme="minorHAnsi" w:cstheme="minorHAnsi"/>
-          <w:sz w:val="20"/>
-          <w:szCs w:val="20"/>
-        </w:rPr>
-        <w:t>.</w:t>
+        <w:t xml:space="preserve"> A submission should be traceable using its unique submission_id.</w:t>
       </w:r>
     </w:p>
     <w:p>
@@ -934,25 +904,7 @@
           <w:sz w:val="20"/>
           <w:szCs w:val="20"/>
         </w:rPr>
-        <w:t xml:space="preserve"> Dependency and validation failures should result in controlled </w:t>
-      </w:r>
-      <w:proofErr w:type="spellStart"/>
-      <w:r>
-        <w:rPr>
-          <w:rFonts w:asciiTheme="minorHAnsi" w:hAnsiTheme="minorHAnsi" w:cstheme="minorHAnsi"/>
-          <w:sz w:val="20"/>
-          <w:szCs w:val="20"/>
-        </w:rPr>
-        <w:t>behaviour</w:t>
-      </w:r>
-      <w:proofErr w:type="spellEnd"/>
-      <w:r>
-        <w:rPr>
-          <w:rFonts w:asciiTheme="minorHAnsi" w:hAnsiTheme="minorHAnsi" w:cstheme="minorHAnsi"/>
-          <w:sz w:val="20"/>
-          <w:szCs w:val="20"/>
-        </w:rPr>
-        <w:t xml:space="preserve"> rather than an unexplained crash.</w:t>
+        <w:t xml:space="preserve"> Dependency and validation failures should result in controlled behaviour rather than an unexplained crash.</w:t>
       </w:r>
     </w:p>
     <w:p>
@@ -1090,31 +1042,7 @@
     <w:p/>
     <w:p>
       <w:r>
-        <w:t xml:space="preserve">The target cloud architecture consists of API Gateway, AWS Lambda functions, Amazon DynamoDB, Amazon </w:t>
-      </w:r>
-      <w:proofErr w:type="spellStart"/>
-      <w:r>
-        <w:t>EventBridge</w:t>
-      </w:r>
-      <w:proofErr w:type="spellEnd"/>
-      <w:r>
-        <w:t xml:space="preserve"> Scheduler, and Amazon CloudWatch. For local testing, equivalent or simulated components were used: Lambda handlers were executed using AWS SAM Local, DynamoDB was represented by DynamoDB Local, S3 events were represented using test event fixtures, and the expiry function was manually invoked instead of using a live </w:t>
-      </w:r>
-      <w:proofErr w:type="spellStart"/>
-      <w:r>
-        <w:t>EventBridge</w:t>
-      </w:r>
-      <w:proofErr w:type="spellEnd"/>
-      <w:r>
-        <w:t xml:space="preserve"> schedule. This distinction is important because the local environment demonstrates application </w:t>
-      </w:r>
-      <w:proofErr w:type="spellStart"/>
-      <w:r>
-        <w:t>behaviour</w:t>
-      </w:r>
-      <w:proofErr w:type="spellEnd"/>
-      <w:r>
-        <w:t xml:space="preserve"> without falsely claiming that the complete AWS deployment was validated.</w:t>
+        <w:t xml:space="preserve">The target cloud architecture consists of API Gateway, AWS Lambda functions, Amazon DynamoDB, Amazon EventBridge Scheduler, and Amazon CloudWatch. For local testing, equivalent or simulated components were used: Lambda handlers were executed using AWS SAM Local, DynamoDB was represented by DynamoDB Local, S3 events were represented using test event fixtures, and the expiry function was manually invoked instead of using a live EventBridge schedule. This distinction is important because the local environment demonstrates application behaviour without falsely claiming that the complete AWS deployment was validated.</w:t>
       </w:r>
     </w:p>
     <w:p/>
@@ -1242,23 +1170,7 @@
     </w:p>
     <w:p>
       <w:r>
-        <w:t xml:space="preserve">The project selected </w:t>
-      </w:r>
-      <w:proofErr w:type="gramStart"/>
-      <w:r>
-        <w:t>a serverless</w:t>
-      </w:r>
-      <w:proofErr w:type="gramEnd"/>
-      <w:r>
-        <w:t xml:space="preserve">/event-driven architecture because the submission </w:t>
-      </w:r>
-      <w:proofErr w:type="gramStart"/>
-      <w:r>
-        <w:t>service naturally</w:t>
-      </w:r>
-      <w:proofErr w:type="gramEnd"/>
-      <w:r>
-        <w:t xml:space="preserve"> consists of independent processing events. This architecture allows individual processing functions to perform specific responsibilities rather than placing all functionality in one large application component. DynamoDB was chosen as the persistence model because the main requirement is to store and retrieve submission state using a unique identifier. AWS SAM Local was used to execute the Lambda-style functions in a local environment, maintaining a clear mapping to the intended AWS architecture while adhering to cost-control requirements.</w:t>
+        <w:t xml:space="preserve">The project selected a serverless/event-driven architecture because the submission service naturally consists of independent processing events. This architecture allows individual processing functions to perform specific responsibilities rather than placing all functionality in one large application component. DynamoDB was chosen as the persistence model because the main requirement is to store and retrieve submission state using a unique identifier. AWS SAM Local was used to execute the Lambda-style functions in a local environment, maintaining a clear mapping to the intended AWS architecture while adhering to cost-control requirements.</w:t>
       </w:r>
     </w:p>
     <w:p/>
@@ -1443,23 +1355,7 @@
                 <w:sz w:val="20"/>
                 <w:szCs w:val="20"/>
               </w:rPr>
-              <w:t xml:space="preserve">S3 </w:t>
-            </w:r>
-            <w:proofErr w:type="spellStart"/>
-            <w:r>
-              <w:rPr>
-                <w:sz w:val="20"/>
-                <w:szCs w:val="20"/>
-              </w:rPr>
-              <w:t>ObjectCreated</w:t>
-            </w:r>
-            <w:proofErr w:type="spellEnd"/>
-            <w:r>
-              <w:rPr>
-                <w:sz w:val="20"/>
-                <w:szCs w:val="20"/>
-              </w:rPr>
-              <w:t xml:space="preserve"> event</w:t>
+              <w:t xml:space="preserve">S3 ObjectCreated event</w:t>
             </w:r>
           </w:p>
         </w:tc>
@@ -1527,25 +1423,7 @@
                 <w:sz w:val="20"/>
                 <w:szCs w:val="20"/>
               </w:rPr>
-              <w:t xml:space="preserve">Template/design </w:t>
-            </w:r>
-            <w:proofErr w:type="spellStart"/>
-            <w:proofErr w:type="gramStart"/>
-            <w:r>
-              <w:rPr>
-                <w:sz w:val="20"/>
-                <w:szCs w:val="20"/>
-              </w:rPr>
-              <w:t>exists;live</w:t>
-            </w:r>
-            <w:proofErr w:type="spellEnd"/>
-            <w:proofErr w:type="gramEnd"/>
-            <w:r>
-              <w:rPr>
-                <w:sz w:val="20"/>
-                <w:szCs w:val="20"/>
-              </w:rPr>
-              <w:t xml:space="preserve"> deployment</w:t>
+              <w:t xml:space="preserve">Template/design exists;live deployment</w:t>
             </w:r>
           </w:p>
         </w:tc>
@@ -1564,7 +1442,6 @@
                 <w:szCs w:val="20"/>
               </w:rPr>
             </w:pPr>
-            <w:proofErr w:type="spellStart"/>
             <w:r>
               <w:rPr>
                 <w:sz w:val="20"/>
@@ -1572,7 +1449,6 @@
               </w:rPr>
               <w:t>EventBridge</w:t>
             </w:r>
-            <w:proofErr w:type="spellEnd"/>
           </w:p>
         </w:tc>
         <w:tc>
@@ -1685,23 +1561,7 @@
                 <w:sz w:val="20"/>
                 <w:szCs w:val="20"/>
               </w:rPr>
-              <w:t>Least-</w:t>
-            </w:r>
-            <w:proofErr w:type="spellStart"/>
-            <w:r>
-              <w:rPr>
-                <w:sz w:val="20"/>
-                <w:szCs w:val="20"/>
-              </w:rPr>
-              <w:t>priviledge</w:t>
-            </w:r>
-            <w:proofErr w:type="spellEnd"/>
-            <w:r>
-              <w:rPr>
-                <w:sz w:val="20"/>
-                <w:szCs w:val="20"/>
-              </w:rPr>
-              <w:t xml:space="preserve"> design documented</w:t>
+              <w:t xml:space="preserve">Least-priviledge design documented</w:t>
             </w:r>
           </w:p>
         </w:tc>
@@ -1813,84 +1673,22 @@
     <w:p/>
     <w:p>
       <w:r>
-        <w:t>-</w:t>
-      </w:r>
-      <w:proofErr w:type="spellStart"/>
-      <w:r>
-        <w:t>RequestUploadFunction</w:t>
-      </w:r>
-      <w:proofErr w:type="spellEnd"/>
-      <w:r>
-        <w:t>: Receives a submission request and performs initial validation. For a valid request, it generates a `</w:t>
-      </w:r>
-      <w:proofErr w:type="spellStart"/>
-      <w:r>
-        <w:t>submission_id</w:t>
-      </w:r>
-      <w:proofErr w:type="spellEnd"/>
-      <w:r>
-        <w:t>`, records the submission, and returns a PENDING response.</w:t>
-      </w:r>
-    </w:p>
-    <w:p>
-      <w:r>
-        <w:t>-</w:t>
-      </w:r>
-      <w:proofErr w:type="spellStart"/>
-      <w:r>
-        <w:t>ProcessUploadFunction</w:t>
-      </w:r>
-      <w:proofErr w:type="spellEnd"/>
-      <w:r>
-        <w:t>: Processes the uploaded submission and compares the expected metadata with the uploaded information. When the metadata matches, the submission moves from PENDING to ACCEPTED. When the metadata does not match, it moves to REJECTED, providing a controlled mechanism for handling inconsistent upload information.</w:t>
-      </w:r>
-    </w:p>
-    <w:p>
-      <w:r>
-        <w:t>-</w:t>
-      </w:r>
-      <w:proofErr w:type="spellStart"/>
-      <w:r>
-        <w:t>GetSubmissionFunction</w:t>
-      </w:r>
-      <w:proofErr w:type="spellEnd"/>
-      <w:r>
-        <w:t>: Uses the `</w:t>
-      </w:r>
-      <w:proofErr w:type="spellStart"/>
-      <w:r>
-        <w:t>submission_id</w:t>
-      </w:r>
-      <w:proofErr w:type="spellEnd"/>
-      <w:r>
-        <w:t xml:space="preserve">` to retrieve the durable submission state. This demonstrated that the final state was not merely present in a log </w:t>
-      </w:r>
-      <w:r>
-        <w:t>message but</w:t>
-      </w:r>
-      <w:r>
-        <w:t xml:space="preserve"> stored and subsequently retrievable from DynamoDB Local.</w:t>
-      </w:r>
-    </w:p>
-    <w:p>
-      <w:r>
-        <w:t>-</w:t>
-      </w:r>
-      <w:proofErr w:type="spellStart"/>
-      <w:r>
-        <w:t>ExpirePendingFunction</w:t>
-      </w:r>
-      <w:proofErr w:type="spellEnd"/>
-      <w:r>
-        <w:t>: Identifies pending submissions whose permitted processing period has elapsed. For repeatable testing, the test fixture deliberately used an expired timestamp rather than waiting for the normal expiry period. The production expiry logic itself was not shortened for the test. The local test returned an `</w:t>
-      </w:r>
-      <w:proofErr w:type="spellStart"/>
-      <w:r>
-        <w:t>expired_count</w:t>
-      </w:r>
-      <w:proofErr w:type="spellEnd"/>
-      <w:r>
-        <w:t>` of 1 and the resulting DynamoDB Local record showed the EXPIRED state.</w:t>
+        <w:t>-RequestUploadFunction: Receives a submission request and performs initial validation. For a valid request, it generates a `submission_id`, records the submission, and returns a PENDING response.</w:t>
+      </w:r>
+    </w:p>
+    <w:p>
+      <w:r>
+        <w:t>-ProcessUploadFunction: Processes the uploaded submission and compares the expected metadata with the uploaded information. When the metadata matches, the submission moves from PENDING to ACCEPTED. When the metadata does not match, it moves to REJECTED, providing a controlled mechanism for handling inconsistent upload information.</w:t>
+      </w:r>
+    </w:p>
+    <w:p>
+      <w:r>
+        <w:t xml:space="preserve">-GetSubmissionFunction: Uses the `submission_id` to retrieve the durable submission state. This demonstrated that the final state was not merely present in a log message but stored and subsequently retrievable from DynamoDB Local.</w:t>
+      </w:r>
+    </w:p>
+    <w:p>
+      <w:r>
+        <w:t>-ExpirePendingFunction: Identifies pending submissions whose permitted processing period has elapsed. For repeatable testing, the test fixture deliberately used an expired timestamp rather than waiting for the normal expiry period. The production expiry logic itself was not shortened for the test. The local test returned an `expired_count` of 1 and the resulting DynamoDB Local record showed the EXPIRED state.</w:t>
       </w:r>
     </w:p>
     <w:p/>
@@ -1972,26 +1770,10 @@
         <w:t>Normal Case 1 - Valid Submission</w:t>
       </w:r>
       <w:r>
-        <w:t>: A valid PDF submission event was provided to `</w:t>
-      </w:r>
-      <w:proofErr w:type="spellStart"/>
-      <w:r>
-        <w:t>RequestUploadFunction</w:t>
-      </w:r>
-      <w:proofErr w:type="spellEnd"/>
-      <w:r>
-        <w:t xml:space="preserve">`. </w:t>
-      </w:r>
-      <w:r>
-        <w:br/>
-      </w:r>
-      <w:r>
+        <w:t xml:space="preserve">: A valid PDF submission event was provided to `RequestUploadFunction`. </w:t>
+        <w:br/>
         <w:t xml:space="preserve">The request was accepted. </w:t>
-      </w:r>
-      <w:r>
-        <w:br/>
-      </w:r>
-      <w:r>
+        <w:br/>
         <w:br/>
       </w:r>
       <w:r>
@@ -2060,30 +1842,11 @@
         <w:t>- Valid Processing</w:t>
       </w:r>
       <w:r>
-        <w:t xml:space="preserve">: </w:t>
-      </w:r>
-      <w:r>
-        <w:t>The valid submission was passed through the processing stag</w:t>
-      </w:r>
-      <w:r>
-        <w:t>e</w:t>
-      </w:r>
-      <w:r>
-        <w:t xml:space="preserve">. </w:t>
-      </w:r>
-      <w:r>
-        <w:br/>
-      </w:r>
-      <w:r>
+        <w:t xml:space="preserve">: The valid submission was passed through the processing stage. </w:t>
+        <w:br/>
         <w:t>The declared and uploaded metadata matched, and the processing logs showed the submission moving from PENDING to ACCEPTED.</w:t>
-      </w:r>
-      <w:r>
-        <w:br/>
-      </w:r>
-      <w:r>
-        <w:br/>
-      </w:r>
-      <w:r>
+        <w:br/>
+        <w:br/>
         <w:t xml:space="preserve"> </w:t>
       </w:r>
       <w:r>
@@ -2130,17 +1893,7 @@
       </w:r>
       <w:r>
         <w:br/>
-      </w:r>
-      <w:r>
-        <w:t>Result</w:t>
-      </w:r>
-      <w:r>
-        <w:t>s</w:t>
-      </w:r>
-      <w:r>
-        <w:t>: PASS</w:t>
-      </w:r>
-      <w:r>
+        <w:t>Results: PASS</w:t>
         <w:br/>
       </w:r>
     </w:p>
@@ -2153,55 +1906,11 @@
         <w:t>Normal Case 3 - Repeated/Retrieval Journey</w:t>
       </w:r>
       <w:r>
-        <w:t>:</w:t>
-      </w:r>
-      <w:r>
-        <w:t xml:space="preserve"> </w:t>
-      </w:r>
-      <w:r>
-        <w:t>The completed submission was retrieved using its `</w:t>
-      </w:r>
-      <w:proofErr w:type="spellStart"/>
-      <w:r>
-        <w:t>submission_id</w:t>
-      </w:r>
-      <w:proofErr w:type="spellEnd"/>
-      <w:r>
-        <w:t>`. `</w:t>
-      </w:r>
-      <w:proofErr w:type="spellStart"/>
-      <w:r>
-        <w:t>GetSubmission</w:t>
-      </w:r>
-      <w:proofErr w:type="spellEnd"/>
-      <w:r>
-        <w:t xml:space="preserve">` successfully retrieved the accepted submission from </w:t>
-      </w:r>
-      <w:proofErr w:type="spellStart"/>
-      <w:r>
-        <w:t>DynamoD</w:t>
-      </w:r>
-      <w:proofErr w:type="spellEnd"/>
-      <w:r>
-        <w:t xml:space="preserve"> Local. </w:t>
-      </w:r>
-      <w:r>
-        <w:br/>
-      </w:r>
-      <w:r>
-        <w:br/>
-      </w:r>
-      <w:r>
-        <w:br/>
-      </w:r>
-      <w:r>
-        <w:t>Result</w:t>
-      </w:r>
-      <w:r>
-        <w:t>s</w:t>
-      </w:r>
-      <w:r>
-        <w:t>: PASS</w:t>
+        <w:t xml:space="preserve">: The completed submission was retrieved using its `submission_id`. `GetSubmission` successfully retrieved the accepted submission from DynamoD Local. </w:t>
+        <w:br/>
+        <w:br/>
+        <w:br/>
+        <w:t>Results: PASS</w:t>
       </w:r>
     </w:p>
     <w:p/>
@@ -2216,11 +1925,7 @@
     <w:p>
       <w:r>
         <w:t xml:space="preserve">One boundary-valid value was included in the final testing strategy to verify that an input at the permitted limit is accepted rather than incorrectly rejected. For file metadata, the permitted boundary was treated as a valid input when it satisfied the application's declared validation rule. </w:t>
-      </w:r>
-      <w:r>
-        <w:br/>
-      </w:r>
-      <w:r>
+        <w:br/>
         <w:br/>
       </w:r>
       <w:r>
@@ -2267,15 +1972,7 @@
       </w:r>
       <w:r>
         <w:br/>
-      </w:r>
-      <w:r>
-        <w:t>Result</w:t>
-      </w:r>
-      <w:r>
-        <w:t>s</w:t>
-      </w:r>
-      <w:r>
-        <w:t>: PASS</w:t>
+        <w:t>Results: PASS</w:t>
       </w:r>
     </w:p>
     <w:p/>
@@ -2284,10 +1981,7 @@
         <w:pStyle w:val="Heading2"/>
       </w:pPr>
       <w:r>
-        <w:t>Invalid Cas</w:t>
-      </w:r>
-      <w:r>
-        <w:t>es</w:t>
+        <w:t>Invalid Cases</w:t>
       </w:r>
     </w:p>
     <w:p>
@@ -2296,35 +1990,13 @@
           <w:b/>
           <w:bCs/>
         </w:rPr>
-        <w:t>Invalid case</w:t>
-      </w:r>
-      <w:r>
-        <w:rPr>
-          <w:b/>
-          <w:bCs/>
-        </w:rPr>
-        <w:t xml:space="preserve"> 1</w:t>
-      </w:r>
-      <w:r>
-        <w:rPr>
-          <w:b/>
-          <w:bCs/>
-        </w:rPr>
-        <w:t>: Unsupported file type</w:t>
+        <w:t xml:space="preserve">Invalid case 1: Unsupported file type</w:t>
       </w:r>
       <w:r>
         <w:t xml:space="preserve"> </w:t>
-      </w:r>
-      <w:r>
-        <w:br/>
-      </w:r>
-      <w:r>
+        <w:br/>
         <w:t>An invalid event used a `.ppt` file with an `application/octet-stream` content type. The application rejected the request with HTTP 400 instead of allowing the unsupported file type to proceed. A separate database check found no durable record for the invalid file, proving that the invalid request did not create an unintended application record.</w:t>
-      </w:r>
-      <w:r>
-        <w:br/>
-      </w:r>
-      <w:r>
+        <w:br/>
         <w:br/>
       </w:r>
       <w:r>
@@ -2371,15 +2043,7 @@
       </w:r>
       <w:r>
         <w:br/>
-      </w:r>
-      <w:r>
-        <w:t>Result</w:t>
-      </w:r>
-      <w:r>
-        <w:t>s</w:t>
-      </w:r>
-      <w:r>
-        <w:t>: PASS</w:t>
+        <w:t>Results: PASS</w:t>
       </w:r>
     </w:p>
     <w:p/>
@@ -2400,17 +2064,7 @@
     </w:p>
     <w:p>
       <w:r>
-        <w:t xml:space="preserve">A second invalid scenario deliberately used inconsistent metadata. The declared size was 2 MB, while the simulated uploaded size was 2.3 MB. The mismatch resulted in the submission moving from PENDING to REJECTED. The rejected state was then retrieved from DynamoDB Local, proving that the </w:t>
-      </w:r>
-      <w:proofErr w:type="gramStart"/>
-      <w:r>
-        <w:t>failure state</w:t>
-      </w:r>
-      <w:proofErr w:type="gramEnd"/>
-      <w:r>
-        <w:t xml:space="preserve"> itself was durably represented.</w:t>
-      </w:r>
-      <w:r>
+        <w:t xml:space="preserve">A second invalid scenario deliberately used inconsistent metadata. The declared size was 2 MB, while the simulated uploaded size was 2.3 MB. The mismatch resulted in the submission moving from PENDING to REJECTED. The rejected state was then retrieved from DynamoDB Local, proving that the failure state itself was durably represented.</w:t>
         <w:br/>
       </w:r>
       <w:r>
@@ -2457,15 +2111,7 @@
       </w:r>
       <w:r>
         <w:br/>
-      </w:r>
-      <w:r>
-        <w:t xml:space="preserve"> Result</w:t>
-      </w:r>
-      <w:r>
-        <w:t>s</w:t>
-      </w:r>
-      <w:r>
-        <w:t>: PASS</w:t>
+        <w:t xml:space="preserve"> Results: PASS</w:t>
       </w:r>
     </w:p>
     <w:p/>
@@ -2479,40 +2125,14 @@
     </w:p>
     <w:p>
       <w:r>
-        <w:t xml:space="preserve">A dependency failure represents a situation where a required service, such as the database, is unavailable. The final architecture </w:t>
-      </w:r>
-      <w:proofErr w:type="spellStart"/>
-      <w:r>
-        <w:t>recognises</w:t>
-      </w:r>
-      <w:proofErr w:type="spellEnd"/>
-      <w:r>
-        <w:t xml:space="preserve"> DynamoDB as a persistence dependency. If the persistence layer cannot be reached, the application should not report a successful durable submission.</w:t>
+        <w:t xml:space="preserve">A dependency failure represents a situation where a required service, such as the database, is unavailable. The final architecture recognises DynamoDB as a persistence dependency. If the persistence layer cannot be reached, the application should not report a successful durable submission.</w:t>
       </w:r>
     </w:p>
     <w:p/>
     <w:p>
       <w:r>
-        <w:t>During testing, the system attempted to write to a non-existent DynamoDB table. The system correctly failed with a `</w:t>
-      </w:r>
-      <w:proofErr w:type="spellStart"/>
-      <w:r>
-        <w:t>ResourceNotFoundException</w:t>
-      </w:r>
-      <w:proofErr w:type="spellEnd"/>
-      <w:r>
-        <w:t>` (see Figure X). This demonstrates a</w:t>
-      </w:r>
-      <w:r>
-        <w:t xml:space="preserve"> </w:t>
-      </w:r>
-      <w:r>
-        <w:t xml:space="preserve">hard failure mode. The application correctly logged the error and avoided falsely reporting successful persistence, but it returned a 500 error to the user rather than degrading gracefully. </w:t>
-      </w:r>
-      <w:r>
-        <w:br/>
-      </w:r>
-      <w:r>
+        <w:t xml:space="preserve">During testing, the system attempted to write to a non-existent DynamoDB table. The system correctly failed with a `ResourceNotFoundException` (see the screenshot below). This demonstrates a hard failure mode. The application correctly logged the error and avoided falsely reporting successful persistence, but it returned a 500 error to the user rather than degrading gracefully. </w:t>
+        <w:br/>
         <w:br/>
       </w:r>
       <w:r>
@@ -2562,15 +2182,7 @@
       </w:r>
       <w:r>
         <w:br/>
-      </w:r>
-      <w:r>
-        <w:t>Result</w:t>
-      </w:r>
-      <w:r>
-        <w:t>s</w:t>
-      </w:r>
-      <w:r>
-        <w:t>: PASS (Controlled failure logged, but highlights need for degradation strategy).</w:t>
+        <w:t>Results: PASS (Controlled failure logged, but highlights need for degradation strategy).</w:t>
       </w:r>
     </w:p>
     <w:p/>
@@ -2585,24 +2197,10 @@
     <w:p>
       <w:r>
         <w:t>The system supports controlled degradation through explicit states: PENDING, ACCEPTED, REJECTED, and EXPIRED. An expired pending submission is deliberately transitioned to EXPIRED, preventing the system from leaving stale pending records without an identifiable outcome. The metadata mismatch case similarly prevents an inconsistent upload from being treated as accepted.</w:t>
-      </w:r>
-      <w:r>
-        <w:br/>
-      </w:r>
-      <w:r>
-        <w:br/>
-      </w:r>
-      <w:r>
-        <w:br/>
-      </w:r>
-      <w:r>
-        <w:t xml:space="preserve"> Result</w:t>
-      </w:r>
-      <w:r>
-        <w:t>s</w:t>
-      </w:r>
-      <w:r>
-        <w:t>: PASS</w:t>
+        <w:br/>
+        <w:br/>
+        <w:br/>
+        <w:t xml:space="preserve"> Results: PASS</w:t>
       </w:r>
     </w:p>
     <w:p/>
@@ -2621,15 +2219,7 @@
     </w:p>
     <w:p>
       <w:r>
-        <w:t xml:space="preserve">`python -m </w:t>
-      </w:r>
-      <w:proofErr w:type="spellStart"/>
-      <w:r>
-        <w:t>pytest</w:t>
-      </w:r>
-      <w:proofErr w:type="spellEnd"/>
-      <w:r>
-        <w:t xml:space="preserve"> tests/unit/test_request_upload.py -v`</w:t>
+        <w:t xml:space="preserve">`python -m pytest tests/unit/test_request_upload.py -v`</w:t>
       </w:r>
     </w:p>
     <w:p/>
@@ -2640,42 +2230,10 @@
         </w:rPr>
       </w:pPr>
       <w:r>
-        <w:t>The test checks that an unsupported file type produces HTTP 400, the expected safe error, and a request identifier. The test also verifies the sequence: `</w:t>
-      </w:r>
-      <w:proofErr w:type="spellStart"/>
-      <w:r>
-        <w:t>RequestUpload</w:t>
-      </w:r>
-      <w:proofErr w:type="spellEnd"/>
-      <w:r>
-        <w:t xml:space="preserve"> -&gt; DynamoDB Local PENDING -&gt; </w:t>
-      </w:r>
-      <w:proofErr w:type="spellStart"/>
-      <w:r>
-        <w:t>ProcessUpload</w:t>
-      </w:r>
-      <w:proofErr w:type="spellEnd"/>
-      <w:r>
-        <w:t xml:space="preserve"> -&gt; DynamoDB Local creating submission -&gt; ACCEPTED AND </w:t>
-      </w:r>
-      <w:proofErr w:type="spellStart"/>
-      <w:r>
-        <w:t>GetSubmission</w:t>
-      </w:r>
-      <w:proofErr w:type="spellEnd"/>
-      <w:r>
-        <w:t>`. The test uses the actual local persistence layer while representing S3 delivery with a simulated event.</w:t>
-      </w:r>
-      <w:r>
-        <w:br/>
-      </w:r>
-      <w:r>
-        <w:br/>
-      </w:r>
-      <w:r>
-        <w:br/>
-      </w:r>
-      <w:r>
+        <w:t xml:space="preserve">The test checks that an unsupported file type produces HTTP 400, the expected safe error, and a request identifier. The test also verifies the sequence: `RequestUpload -&gt; DynamoDB Local PENDING -&gt; ProcessUpload -&gt; DynamoDB Local creating submission -&gt; ACCEPTED AND GetSubmission`. The test uses the actual local persistence layer while representing S3 delivery with a simulated event.</w:t>
+        <w:br/>
+        <w:br/>
+        <w:br/>
         <w:t>Result: 1 passed</w:t>
       </w:r>
     </w:p>
@@ -2686,6 +2244,16 @@
       </w:pPr>
       <w:r>
         <w:t>Limitations</w:t>
+      </w:r>
+    </w:p>
+    <w:p>
+      <w:r>
+        <w:t xml:space="preserve">The final system was validated locally and not in a live AWS environment, because the group did not have an approved AWS account or live credentials. The Lambda functions were run with AWS SAM Local and persistence was tested with DynamoDB Local. The S3 ObjectCreated event was simulated with a test event, uploaded files were saved to a local storage folder instead of Amazon S3, and the expiry function was invoked manually instead of through EventBridge Scheduler. API Gateway exists as a template and design but was not deployed, CloudWatch was represented by structured local logging, and the least-privilege IAM design was documented but not tested.</w:t>
+      </w:r>
+    </w:p>
+    <w:p>
+      <w:r>
+        <w:t xml:space="preserve">Live AWS deployment was not performed, so the local results do not prove that the AWS-specific integrations, permissions and billing behave the same way in the cloud. The dependency failure test also showed that the service returns a 500 error when DynamoDB is unavailable instead of degrading gracefully, so a retry or error-queue strategy remains future work.</w:t>
       </w:r>
     </w:p>
     <w:p/>
@@ -2702,8 +2270,6 @@
       </w:pPr>
       <w:r>
         <w:t>Security, Privacy and Cost</w:t>
-      </w:r>
-      <w:r>
         <w:br/>
       </w:r>
     </w:p>
@@ -2739,42 +2305,22 @@
     <w:p>
       <w:r>
         <w:t>Input validation is performed before processing. The system checks important properties such as:</w:t>
-      </w:r>
-      <w:r>
         <w:br/>
         <w:t>-Required fields</w:t>
-      </w:r>
-      <w:r>
         <w:br/>
         <w:t>-File type</w:t>
-      </w:r>
-      <w:r>
         <w:br/>
         <w:t>-Content type</w:t>
-      </w:r>
-      <w:r>
         <w:br/>
         <w:t>-File metadata</w:t>
-      </w:r>
-      <w:r>
         <w:br/>
         <w:t>-File size</w:t>
-      </w:r>
-      <w:r>
         <w:br/>
         <w:t>-Submission state</w:t>
-      </w:r>
-      <w:r>
-        <w:br/>
-      </w:r>
-      <w:r>
+        <w:br/>
         <w:br/>
         <w:t>Unsupported input is rejected instead of being accepted silently.</w:t>
-      </w:r>
-      <w:r>
-        <w:br/>
-      </w:r>
-      <w:r>
+        <w:br/>
         <w:br/>
       </w:r>
       <w:r>
@@ -2785,22 +2331,8 @@
       </w:r>
       <w:r>
         <w:br/>
-      </w:r>
-      <w:r>
-        <w:t xml:space="preserve">No AWS secret keys, passwords, or </w:t>
-      </w:r>
-      <w:proofErr w:type="gramStart"/>
-      <w:r>
-        <w:t>`.env</w:t>
-      </w:r>
-      <w:proofErr w:type="gramEnd"/>
-      <w:r>
-        <w:t>` files containing secrets are committed. Example configuration contains placeholders only.</w:t>
-      </w:r>
-      <w:r>
-        <w:br/>
-      </w:r>
-      <w:r>
+        <w:t xml:space="preserve">No AWS secret keys, passwords, or `.env` files containing secrets are committed. Example configuration contains placeholders only.</w:t>
+        <w:br/>
         <w:t>.</w:t>
       </w:r>
     </w:p>
@@ -2809,102 +2341,52 @@
         <w:rPr>
           <w:rStyle w:val="Heading2Char"/>
         </w:rPr>
-        <w:t xml:space="preserve">5.3 </w:t>
+        <w:t xml:space="preserve">5.3 Data Minimisation</w:t>
+      </w:r>
+      <w:r>
+        <w:br/>
+        <w:t xml:space="preserve"> The service stores information required to identify and process a submission and avoids storing unnecessary personal information. The test environment uses synthetic data rather than real student records.</w:t>
+        <w:br/>
+        <w:br/>
       </w:r>
       <w:r>
         <w:rPr>
           <w:rStyle w:val="Heading2Char"/>
         </w:rPr>
-        <w:t xml:space="preserve">Data </w:t>
-      </w:r>
-      <w:proofErr w:type="spellStart"/>
+        <w:t xml:space="preserve">5.4 Cost</w:t>
+      </w:r>
+      <w:r>
+        <w:br/>
+        <w:t xml:space="preserve"> The team used local emulation to avoid unnecessary cloud expenditure. The absence of live AWS credentials prevented the team from validating actual AWS billing and cloud service charges. This was an intentional cost and access constraint. The final cloud deployment should only be performed in an approved environment with appropriate billing controls.</w:t>
+      </w:r>
+    </w:p>
+    <w:p/>
+    <w:p>
       <w:r>
         <w:rPr>
           <w:rStyle w:val="Heading2Char"/>
         </w:rPr>
-        <w:t>Minimisation</w:t>
-      </w:r>
-      <w:proofErr w:type="spellEnd"/>
-      <w:r>
-        <w:br/>
-      </w:r>
-      <w:r>
-        <w:t xml:space="preserve"> The service stores information required to identify and process a submission and avoids storing unnecessary personal information. The test environment uses synthetic data rather than real student records.</w:t>
-      </w:r>
-      <w:r>
-        <w:br/>
-      </w:r>
-      <w:r>
-        <w:br/>
-      </w:r>
+        <w:t>5.5 Assumptions</w:t>
+      </w:r>
+      <w:r>
+        <w:br/>
+        <w:t xml:space="preserve">The system assumes that a user’s have a stable internet connection and upload file in supported formats. It is also assumed that the required cloud services are available and correctly configured.</w:t>
+        <w:br/>
+      </w:r>
+    </w:p>
+    <w:p>
       <w:r>
         <w:rPr>
           <w:rStyle w:val="Heading2Char"/>
         </w:rPr>
-        <w:t xml:space="preserve">5.4 </w:t>
-      </w:r>
-      <w:r>
-        <w:rPr>
-          <w:rStyle w:val="Heading2Char"/>
-        </w:rPr>
-        <w:t>Cost</w:t>
-      </w:r>
-      <w:r>
-        <w:br/>
-      </w:r>
-      <w:r>
-        <w:t xml:space="preserve"> The team used local emulation to avoid unnecessary cloud expenditure. The absence of live AWS credentials prevented the team from validating actual AWS billing</w:t>
-      </w:r>
-      <w:r>
-        <w:t xml:space="preserve"> and</w:t>
-      </w:r>
-      <w:r>
-        <w:t xml:space="preserve"> cloud service charges. This was an intentional cost and access constraint. The final cloud deployment should only be performed in an approved environment with appropriate billing controls.</w:t>
-      </w:r>
-    </w:p>
-    <w:p/>
-    <w:p>
-      <w:r>
-        <w:rPr>
-          <w:rStyle w:val="Heading2Char"/>
-        </w:rPr>
-        <w:t>5.5 Assumptions</w:t>
-      </w:r>
-      <w:r>
-        <w:br/>
-        <w:t xml:space="preserve">The system assumes that </w:t>
-      </w:r>
-      <w:r>
-        <w:t>a user’s</w:t>
-      </w:r>
-      <w:r>
-        <w:t xml:space="preserve"> have a stable internet connection and upload file in supported formats. It is also assumed that the required cloud services are available and correctly configured.</w:t>
-      </w:r>
-      <w:r>
-        <w:br/>
-      </w:r>
-    </w:p>
-    <w:p>
-      <w:r>
-        <w:rPr>
-          <w:rStyle w:val="Heading2Char"/>
-        </w:rPr>
         <w:t>5.6 Alerts and teardown</w:t>
       </w:r>
       <w:r>
         <w:br/>
-      </w:r>
-      <w:r>
         <w:t>Alerts and system logs are used to identify failed uploads, processing errors and other unexpected events. These alerts help the developer identify problems and take corrective action.</w:t>
-      </w:r>
-      <w:r>
-        <w:br/>
-      </w:r>
-      <w:r>
+        <w:br/>
         <w:br/>
         <w:t xml:space="preserve">After testing, temporary resources and test data were removed to prevent unnecessary cloud usage and costs. Test files and resources that were no longer required were deleted. </w:t>
-      </w:r>
-      <w:r>
         <w:br/>
       </w:r>
     </w:p>
@@ -2917,71 +2399,20 @@
         </w:numPr>
       </w:pPr>
       <w:r>
-        <w:t xml:space="preserve">Team </w:t>
-      </w:r>
-      <w:r>
-        <w:t>p</w:t>
-      </w:r>
-      <w:r>
-        <w:t xml:space="preserve">rocess and </w:t>
-      </w:r>
-      <w:r>
-        <w:t>r</w:t>
-      </w:r>
-      <w:r>
-        <w:t>eflection</w:t>
+        <w:t xml:space="preserve">Team process and reflection</w:t>
       </w:r>
     </w:p>
     <w:p/>
     <w:p>
       <w:r>
-        <w:t xml:space="preserve">The project follows five major accountability areas: Architecture and integration; Cloud platform and security; Function/application development; Data and observability; and QA, cost and documentation. The handbook specifies that these roles are areas of accountability rather than isolated silos. Every member </w:t>
-      </w:r>
-      <w:proofErr w:type="gramStart"/>
-      <w:r>
-        <w:t xml:space="preserve">is </w:t>
-      </w:r>
-      <w:r>
-        <w:t>able to</w:t>
-      </w:r>
-      <w:proofErr w:type="gramEnd"/>
-      <w:r>
-        <w:t xml:space="preserve"> understand the complete system, review another member's work, and participate in integration and </w:t>
-      </w:r>
-      <w:proofErr w:type="spellStart"/>
-      <w:r>
-        <w:t>defence</w:t>
-      </w:r>
-      <w:proofErr w:type="spellEnd"/>
-      <w:r>
-        <w:t>.</w:t>
+        <w:t xml:space="preserve">The project follows five major accountability areas: Architecture and integration; Cloud platform and security; Function/application development; Data and observability; and QA, cost and documentation. The handbook specifies that these roles are areas of accountability rather than isolated silos. Every member is able to understand the complete system, review another member's work, and participate in integration and defence.</w:t>
       </w:r>
     </w:p>
     <w:p/>
     <w:p>
       <w:r>
-        <w:t xml:space="preserve">The project was developed incrementally across the milestones. Milestone 1 established the problem, requirements, event contract, and initial architecture. Milestone 2 refined </w:t>
-      </w:r>
-      <w:proofErr w:type="gramStart"/>
-      <w:r>
-        <w:t>the architecture</w:t>
-      </w:r>
-      <w:proofErr w:type="gramEnd"/>
-      <w:r>
-        <w:t xml:space="preserve">, security considerations, failure </w:t>
-      </w:r>
-      <w:proofErr w:type="spellStart"/>
-      <w:r>
-        <w:t>behaviour</w:t>
-      </w:r>
-      <w:proofErr w:type="spellEnd"/>
-      <w:r>
-        <w:t>, and platform decision. Milestone 3 implemented the working vertical slice and demonstrated the main event-processing path.</w:t>
-      </w:r>
-      <w:r>
-        <w:br/>
-      </w:r>
-      <w:r>
+        <w:t xml:space="preserve">The project was developed incrementally across the milestones. Milestone 1 established the problem, requirements, event contract, and initial architecture. Milestone 2 refined the architecture, security considerations, failure behaviour, and platform decision. Milestone 3 implemented the working vertical slice and demonstrated the main event-processing path.</w:t>
+        <w:br/>
         <w:br/>
       </w:r>
       <w:r>
@@ -3075,13 +2506,8 @@
           </w:tcPr>
           <w:p>
             <w:r>
-              <w:t xml:space="preserve">Abongile </w:t>
-            </w:r>
-            <w:proofErr w:type="spellStart"/>
-            <w:r>
-              <w:t>Sigidi</w:t>
-            </w:r>
-            <w:proofErr w:type="spellEnd"/>
+              <w:t xml:space="preserve">Abongile Sigidi</w:t>
+            </w:r>
           </w:p>
         </w:tc>
         <w:tc>
@@ -3111,13 +2537,8 @@
             <w:tcW w:w="2840" w:type="dxa"/>
           </w:tcPr>
           <w:p>
-            <w:proofErr w:type="spellStart"/>
-            <w:r>
-              <w:t>Xolile</w:t>
-            </w:r>
-            <w:proofErr w:type="spellEnd"/>
-            <w:r>
-              <w:t xml:space="preserve"> W Sibiya</w:t>
+            <w:r>
+              <w:t xml:space="preserve">Xolile W Sibiya</w:t>
             </w:r>
           </w:p>
         </w:tc>
@@ -3213,13 +2634,8 @@
           </w:tcPr>
           <w:p>
             <w:r>
-              <w:t xml:space="preserve">Nokwanda A </w:t>
-            </w:r>
-            <w:proofErr w:type="spellStart"/>
-            <w:r>
-              <w:t>Mlotshwa</w:t>
-            </w:r>
-            <w:proofErr w:type="spellEnd"/>
+              <w:t xml:space="preserve">Nokwanda A Mlotshwa</w:t>
+            </w:r>
           </w:p>
         </w:tc>
         <w:tc>
@@ -3276,60 +2692,19 @@
     </w:p>
     <w:p>
       <w:r>
-        <w:t>1. Cloud architecture must be tested against the actual environment available to the team</w:t>
-      </w:r>
-      <w:r>
-        <w:t>.</w:t>
-      </w:r>
-      <w:r>
-        <w:br/>
-      </w:r>
-      <w:r>
+        <w:t>1. Cloud architecture must be tested against the actual environment available to the team.</w:t>
+        <w:br/>
         <w:t xml:space="preserve"> The original target architecture included live AWS services, but the lack of an approved AWS account meant that the group could not honestly claim live cloud validation. The team adapted by using local emulators while explicitly documenting which components were simulated.</w:t>
       </w:r>
     </w:p>
     <w:p>
       <w:r>
-        <w:t>2. The value of correlation identifiers.</w:t>
-      </w:r>
-      <w:r>
-        <w:t xml:space="preserve"> </w:t>
-      </w:r>
-      <w:r>
-        <w:t>The `</w:t>
-      </w:r>
-      <w:proofErr w:type="spellStart"/>
-      <w:r>
-        <w:t>submission_id</w:t>
-      </w:r>
-      <w:proofErr w:type="spellEnd"/>
-      <w:r>
-        <w:t>` makes it possible to connect a user's request to processing logs and the final database state.</w:t>
-      </w:r>
-    </w:p>
-    <w:p>
-      <w:r>
-        <w:t xml:space="preserve">3. Invalid </w:t>
-      </w:r>
-      <w:proofErr w:type="gramStart"/>
-      <w:r>
-        <w:t>inputs</w:t>
-      </w:r>
-      <w:proofErr w:type="gramEnd"/>
-      <w:r>
-        <w:t xml:space="preserve"> must be treated as first-class test cases.</w:t>
-      </w:r>
-      <w:r>
-        <w:t xml:space="preserve"> </w:t>
-      </w:r>
-      <w:r>
-        <w:t>The unsupported `.</w:t>
-      </w:r>
-      <w:r>
-        <w:t>ppt</w:t>
-      </w:r>
-      <w:r>
-        <w:t>` test demonstrated that successful processing is not enough; the system must also prove that unsafe or invalid requests are rejected without creating incorrect persistent state.</w:t>
+        <w:t xml:space="preserve">2. The value of correlation identifiers. The `submission_id` makes it possible to connect a user's request to processing logs and the final database state.</w:t>
+      </w:r>
+    </w:p>
+    <w:p>
+      <w:r>
+        <w:t xml:space="preserve">3. Invalid inputs must be treated as first-class test cases. The unsupported `.ppt` test demonstrated that successful processing is not enough; the system must also prove that unsafe or invalid requests are rejected without creating incorrect persistent state.</w:t>
       </w:r>
     </w:p>
     <w:p>
@@ -3351,11 +2726,6 @@
       </w:r>
     </w:p>
     <w:p/>
-    <w:p>
-      <w:r>
-        <w:t>Milestone 4 completes the final evaluation of the Group 3 student file-submission service. The system successfully validates submissions, assigns unique IDs, stores and processes files, and handles accepted, rejected, and expired submissions. Automated testing, logging, security, reproducibility, and cost control were also considered.</w:t>
-      </w:r>
-    </w:p>
     <w:p/>
     <w:p>
       <w:pPr>

</xml_diff>

<commit_message>
Add final architecture diagram and cover page to Milestone 4 report
</commit_message>
<xml_diff>
--- a/report/Milestone_4_Group_3.docx
+++ b/report/Milestone_4_Group_3.docx
@@ -2,6 +2,486 @@
 <file path=word/document.xml><?xml version="1.0" encoding="utf-8"?>
 <w:document xmlns:wpc="http://schemas.microsoft.com/office/word/2010/wordprocessingCanvas" xmlns:cx="http://schemas.microsoft.com/office/drawing/2014/chartex" xmlns:cx1="http://schemas.microsoft.com/office/drawing/2015/9/8/chartex" xmlns:cx2="http://schemas.microsoft.com/office/drawing/2015/10/21/chartex" xmlns:cx3="http://schemas.microsoft.com/office/drawing/2016/5/9/chartex" xmlns:cx4="http://schemas.microsoft.com/office/drawing/2016/5/10/chartex" xmlns:cx5="http://schemas.microsoft.com/office/drawing/2016/5/11/chartex" xmlns:cx6="http://schemas.microsoft.com/office/drawing/2016/5/12/chartex" xmlns:cx7="http://schemas.microsoft.com/office/drawing/2016/5/13/chartex" xmlns:cx8="http://schemas.microsoft.com/office/drawing/2016/5/14/chartex" xmlns:mc="http://schemas.openxmlformats.org/markup-compatibility/2006" xmlns:aink="http://schemas.microsoft.com/office/drawing/2016/ink" xmlns:am3d="http://schemas.microsoft.com/office/drawing/2017/model3d" xmlns:o="urn:schemas-microsoft-com:office:office" xmlns:oel="http://schemas.microsoft.com/office/2019/extlst" xmlns:r="http://schemas.openxmlformats.org/officeDocument/2006/relationships" xmlns:m="http://schemas.openxmlformats.org/officeDocument/2006/math" xmlns:v="urn:schemas-microsoft-com:vml" xmlns:wp14="http://schemas.microsoft.com/office/word/2010/wordprocessingDrawing" xmlns:wp="http://schemas.openxmlformats.org/drawingml/2006/wordprocessingDrawing" xmlns:w10="urn:schemas-microsoft-com:office:word" xmlns:w="http://schemas.openxmlformats.org/wordprocessingml/2006/main" xmlns:w14="http://schemas.microsoft.com/office/word/2010/wordml" xmlns:w15="http://schemas.microsoft.com/office/word/2012/wordml" xmlns:w16cex="http://schemas.microsoft.com/office/word/2018/wordml/cex" xmlns:w16cid="http://schemas.microsoft.com/office/word/2016/wordml/cid" xmlns:w16="http://schemas.microsoft.com/office/word/2018/wordml" xmlns:w16du="http://schemas.microsoft.com/office/word/2023/wordml/word16du" xmlns:w16sdtdh="http://schemas.microsoft.com/office/word/2020/wordml/sdtdatahash" xmlns:w16sdtfl="http://schemas.microsoft.com/office/word/2024/wordml/sdtformatlock" xmlns:w16se="http://schemas.microsoft.com/office/word/2015/wordml/symex" xmlns:wpg="http://schemas.microsoft.com/office/word/2010/wordprocessingGroup" xmlns:wpi="http://schemas.microsoft.com/office/word/2010/wordprocessingInk" xmlns:wne="http://schemas.microsoft.com/office/word/2006/wordml" xmlns:wps="http://schemas.microsoft.com/office/word/2010/wordprocessingShape" mc:Ignorable="w14 w15 w16se w16cid w16 w16cex w16sdtdh w16sdtfl w16du wp14">
   <w:body>
+    <w:p>
+      <w:pPr>
+        <w:spacing w:before="0" w:after="0"/>
+        <w:jc w:val="center"/>
+      </w:pPr>
+      <w:r>
+        <w:rPr>
+          <w:rFonts w:ascii="Times New Roman" w:hAnsi="Times New Roman" w:cs="Times New Roman"/>
+          <w:b/>
+          <w:bCs/>
+          <w:color w:val="000000"/>
+          <w:sz w:val="28"/>
+          <w:szCs w:val="28"/>
+        </w:rPr>
+        <w:t>UNIVERSITY OF ZULULAND</w:t>
+      </w:r>
+    </w:p>
+    <w:p>
+      <w:pPr>
+        <w:spacing w:before="0" w:after="240"/>
+        <w:jc w:val="center"/>
+      </w:pPr>
+      <w:r>
+        <w:rPr>
+          <w:rFonts w:ascii="Times New Roman" w:hAnsi="Times New Roman" w:cs="Times New Roman"/>
+          <w:b/>
+          <w:bCs/>
+          <w:color w:val="000000"/>
+          <w:sz w:val="24"/>
+          <w:szCs w:val="24"/>
+        </w:rPr>
+        <w:t>DEPARTMENT OF COMPUTER SCIENCE</w:t>
+      </w:r>
+    </w:p>
+    <w:p>
+      <w:pPr>
+        <w:spacing w:before="0" w:after="0"/>
+        <w:jc w:val="center"/>
+      </w:pPr>
+      <w:r>
+        <w:rPr>
+          <w:rFonts w:ascii="Times New Roman" w:hAnsi="Times New Roman" w:cs="Times New Roman"/>
+          <w:b/>
+          <w:bCs/>
+          <w:color w:val="000000"/>
+          <w:sz w:val="24"/>
+          <w:szCs w:val="24"/>
+        </w:rPr>
+        <w:t>4CPS501B</w:t>
+      </w:r>
+    </w:p>
+    <w:p>
+      <w:pPr>
+        <w:spacing w:before="0" w:after="120"/>
+        <w:jc w:val="center"/>
+      </w:pPr>
+      <w:r>
+        <w:rPr>
+          <w:rFonts w:ascii="Times New Roman" w:hAnsi="Times New Roman" w:cs="Times New Roman"/>
+          <w:b/>
+          <w:bCs/>
+          <w:color w:val="000000"/>
+          <w:sz w:val="24"/>
+          <w:szCs w:val="24"/>
+        </w:rPr>
+        <w:t>MILESTONE 4</w:t>
+      </w:r>
+    </w:p>
+    <w:p>
+      <w:pPr>
+        <w:spacing w:before="0" w:after="240"/>
+        <w:jc w:val="center"/>
+      </w:pPr>
+      <w:r>
+        <w:rPr>
+          <w:rFonts w:ascii="Times New Roman" w:hAnsi="Times New Roman" w:cs="Times New Roman"/>
+          <w:b/>
+          <w:bCs/>
+          <w:color w:val="000000"/>
+          <w:sz w:val="24"/>
+          <w:szCs w:val="24"/>
+        </w:rPr>
+        <w:t>FINAL RELEASE, DEMONSTRATION AND DEFENCE</w:t>
+      </w:r>
+    </w:p>
+    <w:tbl>
+      <w:tblPr>
+        <w:tblStyle w:val="TableGrid"/>
+        <w:tblW w:w="8306" w:type="dxa"/>
+        <w:tblLayout w:type="fixed"/>
+        <w:tblLook w:val="04A0" w:firstRow="1" w:lastRow="0" w:firstColumn="1" w:lastColumn="0" w:noHBand="0" w:noVBand="1"/>
+      </w:tblPr>
+      <w:tblGrid>
+        <w:gridCol w:w="2200"/>
+        <w:gridCol w:w="6106"/>
+      </w:tblGrid>
+      <w:tr>
+        <w:tc>
+          <w:tcPr>
+            <w:tcW w:w="2200" w:type="dxa"/>
+          </w:tcPr>
+          <w:p>
+            <w:pPr>
+              <w:spacing w:before="40" w:after="40"/>
+              <w:jc w:val="left"/>
+            </w:pPr>
+            <w:r>
+              <w:rPr>
+                <w:rFonts w:ascii="Times New Roman" w:hAnsi="Times New Roman" w:cs="Times New Roman"/>
+                <w:b/>
+                <w:bCs/>
+                <w:color w:val="000000"/>
+                <w:sz w:val="22"/>
+                <w:szCs w:val="22"/>
+              </w:rPr>
+              <w:t xml:space="preserve">Field</w:t>
+            </w:r>
+          </w:p>
+        </w:tc>
+        <w:tc>
+          <w:tcPr>
+            <w:tcW w:w="6106" w:type="dxa"/>
+          </w:tcPr>
+          <w:p>
+            <w:pPr>
+              <w:spacing w:before="40" w:after="40"/>
+              <w:jc w:val="left"/>
+            </w:pPr>
+            <w:r>
+              <w:rPr>
+                <w:rFonts w:ascii="Times New Roman" w:hAnsi="Times New Roman" w:cs="Times New Roman"/>
+                <w:b/>
+                <w:bCs/>
+                <w:color w:val="000000"/>
+                <w:sz w:val="22"/>
+                <w:szCs w:val="22"/>
+              </w:rPr>
+              <w:t xml:space="preserve">Details</w:t>
+            </w:r>
+          </w:p>
+        </w:tc>
+      </w:tr>
+      <w:tr>
+        <w:tc>
+          <w:tcPr>
+            <w:tcW w:w="2200" w:type="dxa"/>
+          </w:tcPr>
+          <w:p>
+            <w:pPr>
+              <w:spacing w:before="40" w:after="40"/>
+              <w:jc w:val="left"/>
+            </w:pPr>
+            <w:r>
+              <w:rPr>
+                <w:rFonts w:ascii="Times New Roman" w:hAnsi="Times New Roman" w:cs="Times New Roman"/>
+                <w:color w:val="000000"/>
+                <w:sz w:val="22"/>
+                <w:szCs w:val="22"/>
+              </w:rPr>
+              <w:t xml:space="preserve">Module</w:t>
+            </w:r>
+          </w:p>
+        </w:tc>
+        <w:tc>
+          <w:tcPr>
+            <w:tcW w:w="6106" w:type="dxa"/>
+          </w:tcPr>
+          <w:p>
+            <w:pPr>
+              <w:spacing w:before="40" w:after="40"/>
+              <w:jc w:val="left"/>
+            </w:pPr>
+            <w:r>
+              <w:rPr>
+                <w:rFonts w:ascii="Times New Roman" w:hAnsi="Times New Roman" w:cs="Times New Roman"/>
+                <w:color w:val="000000"/>
+                <w:sz w:val="22"/>
+                <w:szCs w:val="22"/>
+              </w:rPr>
+              <w:t xml:space="preserve">4CPS501B — Cloud Computing / Distributed Computing Part B</w:t>
+            </w:r>
+          </w:p>
+        </w:tc>
+      </w:tr>
+      <w:tr>
+        <w:tc>
+          <w:tcPr>
+            <w:tcW w:w="2200" w:type="dxa"/>
+          </w:tcPr>
+          <w:p>
+            <w:pPr>
+              <w:spacing w:before="40" w:after="40"/>
+              <w:jc w:val="left"/>
+            </w:pPr>
+            <w:r>
+              <w:rPr>
+                <w:rFonts w:ascii="Times New Roman" w:hAnsi="Times New Roman" w:cs="Times New Roman"/>
+                <w:color w:val="000000"/>
+                <w:sz w:val="22"/>
+                <w:szCs w:val="22"/>
+              </w:rPr>
+              <w:t xml:space="preserve">Practical</w:t>
+            </w:r>
+          </w:p>
+        </w:tc>
+        <w:tc>
+          <w:tcPr>
+            <w:tcW w:w="6106" w:type="dxa"/>
+          </w:tcPr>
+          <w:p>
+            <w:pPr>
+              <w:spacing w:before="40" w:after="40"/>
+              <w:jc w:val="left"/>
+            </w:pPr>
+            <w:r>
+              <w:rPr>
+                <w:rFonts w:ascii="Times New Roman" w:hAnsi="Times New Roman" w:cs="Times New Roman"/>
+                <w:color w:val="000000"/>
+                <w:sz w:val="22"/>
+                <w:szCs w:val="22"/>
+              </w:rPr>
+              <w:t xml:space="preserve">Cloud-Based Event Service — SubmitStudentFile</w:t>
+            </w:r>
+          </w:p>
+        </w:tc>
+      </w:tr>
+      <w:tr>
+        <w:tc>
+          <w:tcPr>
+            <w:tcW w:w="2200" w:type="dxa"/>
+          </w:tcPr>
+          <w:p>
+            <w:pPr>
+              <w:spacing w:before="40" w:after="40"/>
+              <w:jc w:val="left"/>
+            </w:pPr>
+            <w:r>
+              <w:rPr>
+                <w:rFonts w:ascii="Times New Roman" w:hAnsi="Times New Roman" w:cs="Times New Roman"/>
+                <w:color w:val="000000"/>
+                <w:sz w:val="22"/>
+                <w:szCs w:val="22"/>
+              </w:rPr>
+              <w:t xml:space="preserve">Milestone</w:t>
+            </w:r>
+          </w:p>
+        </w:tc>
+        <w:tc>
+          <w:tcPr>
+            <w:tcW w:w="6106" w:type="dxa"/>
+          </w:tcPr>
+          <w:p>
+            <w:pPr>
+              <w:spacing w:before="40" w:after="40"/>
+              <w:jc w:val="left"/>
+            </w:pPr>
+            <w:r>
+              <w:rPr>
+                <w:rFonts w:ascii="Times New Roman" w:hAnsi="Times New Roman" w:cs="Times New Roman"/>
+                <w:color w:val="000000"/>
+                <w:sz w:val="22"/>
+                <w:szCs w:val="22"/>
+              </w:rPr>
+              <w:t xml:space="preserve">Milestone 4 — Final Release, Demonstration and Defence</w:t>
+            </w:r>
+          </w:p>
+        </w:tc>
+      </w:tr>
+      <w:tr>
+        <w:tc>
+          <w:tcPr>
+            <w:tcW w:w="2200" w:type="dxa"/>
+          </w:tcPr>
+          <w:p>
+            <w:pPr>
+              <w:spacing w:before="40" w:after="40"/>
+              <w:jc w:val="left"/>
+            </w:pPr>
+            <w:r>
+              <w:rPr>
+                <w:rFonts w:ascii="Times New Roman" w:hAnsi="Times New Roman" w:cs="Times New Roman"/>
+                <w:color w:val="000000"/>
+                <w:sz w:val="22"/>
+                <w:szCs w:val="22"/>
+              </w:rPr>
+              <w:t xml:space="preserve">Work period</w:t>
+            </w:r>
+          </w:p>
+        </w:tc>
+        <w:tc>
+          <w:tcPr>
+            <w:tcW w:w="6106" w:type="dxa"/>
+          </w:tcPr>
+          <w:p>
+            <w:pPr>
+              <w:spacing w:before="40" w:after="40"/>
+              <w:jc w:val="left"/>
+            </w:pPr>
+            <w:r>
+              <w:rPr>
+                <w:rFonts w:ascii="Times New Roman" w:hAnsi="Times New Roman" w:cs="Times New Roman"/>
+                <w:color w:val="000000"/>
+                <w:sz w:val="22"/>
+                <w:szCs w:val="22"/>
+              </w:rPr>
+              <w:t xml:space="preserve">5 October – 18 October 2026</w:t>
+            </w:r>
+          </w:p>
+        </w:tc>
+      </w:tr>
+      <w:tr>
+        <w:tc>
+          <w:tcPr>
+            <w:tcW w:w="2200" w:type="dxa"/>
+          </w:tcPr>
+          <w:p>
+            <w:pPr>
+              <w:spacing w:before="40" w:after="40"/>
+              <w:jc w:val="left"/>
+            </w:pPr>
+            <w:r>
+              <w:rPr>
+                <w:rFonts w:ascii="Times New Roman" w:hAnsi="Times New Roman" w:cs="Times New Roman"/>
+                <w:color w:val="000000"/>
+                <w:sz w:val="22"/>
+                <w:szCs w:val="22"/>
+              </w:rPr>
+              <w:t xml:space="preserve">Submission date</w:t>
+            </w:r>
+          </w:p>
+        </w:tc>
+        <w:tc>
+          <w:tcPr>
+            <w:tcW w:w="6106" w:type="dxa"/>
+          </w:tcPr>
+          <w:p>
+            <w:pPr>
+              <w:spacing w:before="40" w:after="40"/>
+              <w:jc w:val="left"/>
+            </w:pPr>
+            <w:r>
+              <w:rPr>
+                <w:rFonts w:ascii="Times New Roman" w:hAnsi="Times New Roman" w:cs="Times New Roman"/>
+                <w:color w:val="000000"/>
+                <w:sz w:val="22"/>
+                <w:szCs w:val="22"/>
+              </w:rPr>
+              <w:t xml:space="preserve">18 October 2026</w:t>
+            </w:r>
+          </w:p>
+        </w:tc>
+      </w:tr>
+      <w:tr>
+        <w:tc>
+          <w:tcPr>
+            <w:tcW w:w="2200" w:type="dxa"/>
+          </w:tcPr>
+          <w:p>
+            <w:pPr>
+              <w:spacing w:before="40" w:after="40"/>
+              <w:jc w:val="left"/>
+            </w:pPr>
+            <w:r>
+              <w:rPr>
+                <w:rFonts w:ascii="Times New Roman" w:hAnsi="Times New Roman" w:cs="Times New Roman"/>
+                <w:color w:val="000000"/>
+                <w:sz w:val="22"/>
+                <w:szCs w:val="22"/>
+              </w:rPr>
+              <w:t xml:space="preserve">Repository link</w:t>
+            </w:r>
+          </w:p>
+        </w:tc>
+        <w:tc>
+          <w:tcPr>
+            <w:tcW w:w="6106" w:type="dxa"/>
+          </w:tcPr>
+          <w:p>
+            <w:pPr>
+              <w:spacing w:before="40" w:after="40"/>
+              <w:jc w:val="left"/>
+            </w:pPr>
+            <w:r>
+              <w:rPr>
+                <w:rFonts w:ascii="Times New Roman" w:hAnsi="Times New Roman" w:cs="Times New Roman"/>
+                <w:color w:val="000000"/>
+                <w:sz w:val="22"/>
+                <w:szCs w:val="22"/>
+              </w:rPr>
+              <w:t xml:space="preserve">https://github.com/Abongile1011/group3-cloud-event-service</w:t>
+            </w:r>
+          </w:p>
+        </w:tc>
+      </w:tr>
+      <w:tr>
+        <w:tc>
+          <w:tcPr>
+            <w:tcW w:w="2200" w:type="dxa"/>
+          </w:tcPr>
+          <w:p>
+            <w:pPr>
+              <w:spacing w:before="40" w:after="40"/>
+              <w:jc w:val="left"/>
+            </w:pPr>
+            <w:r>
+              <w:rPr>
+                <w:rFonts w:ascii="Times New Roman" w:hAnsi="Times New Roman" w:cs="Times New Roman"/>
+                <w:color w:val="000000"/>
+                <w:sz w:val="22"/>
+                <w:szCs w:val="22"/>
+              </w:rPr>
+              <w:t xml:space="preserve">Team</w:t>
+            </w:r>
+          </w:p>
+        </w:tc>
+        <w:tc>
+          <w:tcPr>
+            <w:tcW w:w="6106" w:type="dxa"/>
+          </w:tcPr>
+          <w:p>
+            <w:pPr>
+              <w:spacing w:before="40" w:after="40"/>
+              <w:jc w:val="left"/>
+            </w:pPr>
+            <w:r>
+              <w:rPr>
+                <w:rFonts w:ascii="Times New Roman" w:hAnsi="Times New Roman" w:cs="Times New Roman"/>
+                <w:color w:val="000000"/>
+                <w:sz w:val="22"/>
+                <w:szCs w:val="22"/>
+              </w:rPr>
+              <w:t xml:space="preserve">Group 3</w:t>
+            </w:r>
+          </w:p>
+        </w:tc>
+      </w:tr>
+      <w:tr>
+        <w:tc>
+          <w:tcPr>
+            <w:tcW w:w="2200" w:type="dxa"/>
+          </w:tcPr>
+          <w:p>
+            <w:pPr>
+              <w:spacing w:before="40" w:after="40"/>
+              <w:jc w:val="left"/>
+            </w:pPr>
+            <w:r>
+              <w:rPr>
+                <w:rFonts w:ascii="Times New Roman" w:hAnsi="Times New Roman" w:cs="Times New Roman"/>
+                <w:color w:val="000000"/>
+                <w:sz w:val="22"/>
+                <w:szCs w:val="22"/>
+              </w:rPr>
+              <w:t xml:space="preserve">Communication channel</w:t>
+            </w:r>
+          </w:p>
+        </w:tc>
+        <w:tc>
+          <w:tcPr>
+            <w:tcW w:w="6106" w:type="dxa"/>
+          </w:tcPr>
+          <w:p>
+            <w:pPr>
+              <w:spacing w:before="40" w:after="40"/>
+              <w:jc w:val="left"/>
+            </w:pPr>
+            <w:r>
+              <w:rPr>
+                <w:rFonts w:ascii="Times New Roman" w:hAnsi="Times New Roman" w:cs="Times New Roman"/>
+                <w:color w:val="000000"/>
+                <w:sz w:val="22"/>
+                <w:szCs w:val="22"/>
+              </w:rPr>
+              <w:t xml:space="preserve">WhatsApp</w:t>
+            </w:r>
+          </w:p>
+        </w:tc>
+      </w:tr>
+    </w:tbl>
+    <w:p/>
     <w:p>
       <w:pPr>
         <w:pStyle w:val="Heading1"/>
@@ -1043,6 +1523,69 @@
     <w:p>
       <w:r>
         <w:t xml:space="preserve">The target cloud architecture consists of API Gateway, AWS Lambda functions, Amazon DynamoDB, Amazon EventBridge Scheduler, and Amazon CloudWatch. For local testing, equivalent or simulated components were used: Lambda handlers were executed using AWS SAM Local, DynamoDB was represented by DynamoDB Local, S3 events were represented using test event fixtures, and the expiry function was manually invoked instead of using a live EventBridge schedule. This distinction is important because the local environment demonstrates application behaviour without falsely claiming that the complete AWS deployment was validated.</w:t>
+      </w:r>
+    </w:p>
+    <w:p>
+      <w:pPr>
+        <w:keepNext/>
+        <w:jc w:val="center"/>
+      </w:pPr>
+      <w:r>
+        <w:rPr>
+          <w:noProof/>
+        </w:rPr>
+        <w:drawing>
+          <wp:inline distT="0" distB="0" distL="0" distR="0">
+            <wp:extent cx="5274310" cy="4774639"/>
+            <wp:effectExtent l="0" t="0" r="0" b="0"/>
+            <wp:docPr id="50" name="Final architecture diagram" descr="Final architecture and event-flow diagram of the Group 3 student file upload service"/>
+            <wp:cNvGraphicFramePr>
+              <a:graphicFrameLocks xmlns:a="http://schemas.openxmlformats.org/drawingml/2006/main" noChangeAspect="1"/>
+            </wp:cNvGraphicFramePr>
+            <a:graphic xmlns:a="http://schemas.openxmlformats.org/drawingml/2006/main">
+              <a:graphicData uri="http://schemas.openxmlformats.org/drawingml/2006/picture">
+                <pic:pic xmlns:pic="http://schemas.openxmlformats.org/drawingml/2006/picture">
+                  <pic:nvPicPr>
+                    <pic:cNvPr id="50" name="final-architecture.png"/>
+                    <pic:cNvPicPr>
+                      <a:picLocks noChangeAspect="1"/>
+                    </pic:cNvPicPr>
+                  </pic:nvPicPr>
+                  <pic:blipFill>
+                    <a:blip r:embed="rId15"/>
+                    <a:stretch>
+                      <a:fillRect/>
+                    </a:stretch>
+                  </pic:blipFill>
+                  <pic:spPr>
+                    <a:xfrm>
+                      <a:off x="0" y="0"/>
+                      <a:ext cx="5274310" cy="4774639"/>
+                    </a:xfrm>
+                    <a:prstGeom prst="rect">
+                      <a:avLst/>
+                    </a:prstGeom>
+                  </pic:spPr>
+                </pic:pic>
+              </a:graphicData>
+            </a:graphic>
+          </wp:inline>
+        </w:drawing>
+      </w:r>
+    </w:p>
+    <w:p>
+      <w:pPr>
+        <w:jc w:val="center"/>
+      </w:pPr>
+      <w:r>
+        <w:rPr>
+          <w:i/>
+          <w:iCs/>
+          <w:color w:val="000000"/>
+          <w:sz w:val="18"/>
+          <w:szCs w:val="18"/>
+        </w:rPr>
+        <w:t xml:space="preserve">Final architecture and event-flow diagram. The same file is stored in the repository at architecture/diagrams/final-architecture.png.</w:t>
       </w:r>
     </w:p>
     <w:p/>

</xml_diff>